<commit_message>
feat: support multi-student dispensations and admin templates
</commit_message>
<xml_diff>
--- a/templates_surat/active/dispensasi_murid.docx
+++ b/templates_surat/active/dispensasi_murid.docx
@@ -148,6 +148,480 @@
     </w:p>
     <w:tbl>
       <w:tblPr>
+        <w:tblW w:type="dxa" w:w="8371"/>
+        <w:jc w:val="left"/>
+        <w:tblLayout w:type="fixed"/>
+        <w:tblLook w:firstColumn="1" w:firstRow="1" w:lastColumn="0" w:lastRow="0" w:noHBand="0" w:noVBand="1" w:val="04A0"/>
+        <w:tblInd w:w="0" w:type="dxa"/>
+        <w:tblBorders>
+          <w:top w:val="single" w:sz="4" w:color="808080"/>
+          <w:left w:val="single" w:sz="4" w:color="808080"/>
+          <w:bottom w:val="single" w:sz="4" w:color="808080"/>
+          <w:right w:val="single" w:sz="4" w:color="808080"/>
+          <w:insideH w:val="single" w:sz="4" w:color="808080"/>
+          <w:insideV w:val="single" w:sz="4" w:color="808080"/>
+        </w:tblBorders>
+      </w:tblPr>
+      <w:tblGrid>
+        <w:gridCol w:w="700"/>
+        <w:gridCol w:w="3300"/>
+        <w:gridCol w:w="3100"/>
+        <w:gridCol w:w="1271"/>
+      </w:tblGrid>
+      <w:tr>
+        <w:tc>
+          <w:tcPr>
+            <w:tcW w:type="dxa" w:w="700"/>
+            <w:vAlign w:val="center"/>
+            <w:tcMar>
+              <w:top w:w="80" w:type="dxa"/>
+              <w:left w:w="100" w:type="dxa"/>
+              <w:bottom w:w="80" w:type="dxa"/>
+              <w:right w:w="100" w:type="dxa"/>
+            </w:tcMar>
+          </w:tcPr>
+          <w:p>
+            <w:pPr>
+              <w:spacing w:before="0" w:after="0"/>
+              <w:jc w:val="center"/>
+            </w:pPr>
+            <w:r>
+              <w:rPr>
+                <w:rFonts w:ascii="Times New Roman" w:hAnsi="Times New Roman" w:eastAsia="Times New Roman" w:cs="Times New Roman"/>
+                <w:b/>
+                <w:sz w:val="24"/>
+                <w:szCs w:val="24"/>
+              </w:rPr>
+              <w:t>No.</w:t>
+            </w:r>
+          </w:p>
+        </w:tc>
+        <w:tc>
+          <w:tcPr>
+            <w:tcW w:type="dxa" w:w="3300"/>
+            <w:vAlign w:val="center"/>
+            <w:tcMar>
+              <w:top w:w="80" w:type="dxa"/>
+              <w:left w:w="100" w:type="dxa"/>
+              <w:bottom w:w="80" w:type="dxa"/>
+              <w:right w:w="100" w:type="dxa"/>
+            </w:tcMar>
+          </w:tcPr>
+          <w:p>
+            <w:pPr>
+              <w:spacing w:before="0" w:after="0"/>
+              <w:jc w:val="center"/>
+            </w:pPr>
+            <w:r>
+              <w:rPr>
+                <w:rFonts w:ascii="Times New Roman" w:hAnsi="Times New Roman" w:eastAsia="Times New Roman" w:cs="Times New Roman"/>
+                <w:b/>
+                <w:sz w:val="24"/>
+                <w:szCs w:val="24"/>
+              </w:rPr>
+              <w:t>Nama Siswa</w:t>
+            </w:r>
+          </w:p>
+        </w:tc>
+        <w:tc>
+          <w:tcPr>
+            <w:tcW w:type="dxa" w:w="3100"/>
+            <w:vAlign w:val="center"/>
+            <w:tcMar>
+              <w:top w:w="80" w:type="dxa"/>
+              <w:left w:w="100" w:type="dxa"/>
+              <w:bottom w:w="80" w:type="dxa"/>
+              <w:right w:w="100" w:type="dxa"/>
+            </w:tcMar>
+          </w:tcPr>
+          <w:p>
+            <w:pPr>
+              <w:spacing w:before="0" w:after="0"/>
+              <w:jc w:val="center"/>
+            </w:pPr>
+            <w:r>
+              <w:rPr>
+                <w:rFonts w:ascii="Times New Roman" w:hAnsi="Times New Roman" w:eastAsia="Times New Roman" w:cs="Times New Roman"/>
+                <w:b/>
+                <w:sz w:val="24"/>
+                <w:szCs w:val="24"/>
+              </w:rPr>
+              <w:t>NIS / NISN</w:t>
+            </w:r>
+          </w:p>
+        </w:tc>
+        <w:tc>
+          <w:tcPr>
+            <w:tcW w:type="dxa" w:w="1271"/>
+            <w:vAlign w:val="center"/>
+            <w:tcMar>
+              <w:top w:w="80" w:type="dxa"/>
+              <w:left w:w="100" w:type="dxa"/>
+              <w:bottom w:w="80" w:type="dxa"/>
+              <w:right w:w="100" w:type="dxa"/>
+            </w:tcMar>
+          </w:tcPr>
+          <w:p>
+            <w:pPr>
+              <w:spacing w:before="0" w:after="0"/>
+              <w:jc w:val="center"/>
+            </w:pPr>
+            <w:r>
+              <w:rPr>
+                <w:rFonts w:ascii="Times New Roman" w:hAnsi="Times New Roman" w:eastAsia="Times New Roman" w:cs="Times New Roman"/>
+                <w:b/>
+                <w:sz w:val="24"/>
+                <w:szCs w:val="24"/>
+              </w:rPr>
+              <w:t>Kelas</w:t>
+            </w:r>
+          </w:p>
+        </w:tc>
+      </w:tr>
+      <w:tr>
+        <w:tc>
+          <w:tcPr>
+            <w:tcW w:type="dxa" w:w="700"/>
+            <w:vAlign w:val="center"/>
+            <w:tcMar>
+              <w:top w:w="80" w:type="dxa"/>
+              <w:left w:w="100" w:type="dxa"/>
+              <w:bottom w:w="80" w:type="dxa"/>
+              <w:right w:w="100" w:type="dxa"/>
+            </w:tcMar>
+          </w:tcPr>
+          <w:p>
+            <w:pPr>
+              <w:spacing w:before="0" w:after="0"/>
+              <w:jc w:val="center"/>
+            </w:pPr>
+            <w:r>
+              <w:rPr>
+                <w:rFonts w:ascii="Times New Roman" w:hAnsi="Times New Roman" w:eastAsia="Times New Roman" w:cs="Times New Roman"/>
+                <w:b w:val="0"/>
+                <w:sz w:val="24"/>
+                <w:szCs w:val="24"/>
+              </w:rPr>
+              <w:t>{%tr for student in students %}</w:t>
+            </w:r>
+          </w:p>
+        </w:tc>
+        <w:tc>
+          <w:tcPr>
+            <w:tcW w:type="dxa" w:w="3300"/>
+            <w:vAlign w:val="center"/>
+            <w:tcMar>
+              <w:top w:w="80" w:type="dxa"/>
+              <w:left w:w="100" w:type="dxa"/>
+              <w:bottom w:w="80" w:type="dxa"/>
+              <w:right w:w="100" w:type="dxa"/>
+            </w:tcMar>
+          </w:tcPr>
+          <w:p>
+            <w:pPr>
+              <w:spacing w:before="0" w:after="0"/>
+              <w:jc w:val="center"/>
+            </w:pPr>
+            <w:r>
+              <w:rPr>
+                <w:rFonts w:ascii="Times New Roman" w:hAnsi="Times New Roman" w:eastAsia="Times New Roman" w:cs="Times New Roman"/>
+                <w:b w:val="0"/>
+                <w:sz w:val="24"/>
+                <w:szCs w:val="24"/>
+              </w:rPr>
+            </w:r>
+          </w:p>
+        </w:tc>
+        <w:tc>
+          <w:tcPr>
+            <w:tcW w:type="dxa" w:w="3100"/>
+            <w:vAlign w:val="center"/>
+            <w:tcMar>
+              <w:top w:w="80" w:type="dxa"/>
+              <w:left w:w="100" w:type="dxa"/>
+              <w:bottom w:w="80" w:type="dxa"/>
+              <w:right w:w="100" w:type="dxa"/>
+            </w:tcMar>
+          </w:tcPr>
+          <w:p>
+            <w:pPr>
+              <w:spacing w:before="0" w:after="0"/>
+              <w:jc w:val="center"/>
+            </w:pPr>
+            <w:r>
+              <w:rPr>
+                <w:rFonts w:ascii="Times New Roman" w:hAnsi="Times New Roman" w:eastAsia="Times New Roman" w:cs="Times New Roman"/>
+                <w:b w:val="0"/>
+                <w:sz w:val="24"/>
+                <w:szCs w:val="24"/>
+              </w:rPr>
+            </w:r>
+          </w:p>
+        </w:tc>
+        <w:tc>
+          <w:tcPr>
+            <w:tcW w:type="dxa" w:w="1271"/>
+            <w:vAlign w:val="center"/>
+            <w:tcMar>
+              <w:top w:w="80" w:type="dxa"/>
+              <w:left w:w="100" w:type="dxa"/>
+              <w:bottom w:w="80" w:type="dxa"/>
+              <w:right w:w="100" w:type="dxa"/>
+            </w:tcMar>
+          </w:tcPr>
+          <w:p>
+            <w:pPr>
+              <w:spacing w:before="0" w:after="0"/>
+              <w:jc w:val="center"/>
+            </w:pPr>
+            <w:r>
+              <w:rPr>
+                <w:rFonts w:ascii="Times New Roman" w:hAnsi="Times New Roman" w:eastAsia="Times New Roman" w:cs="Times New Roman"/>
+                <w:b w:val="0"/>
+                <w:sz w:val="24"/>
+                <w:szCs w:val="24"/>
+              </w:rPr>
+            </w:r>
+          </w:p>
+        </w:tc>
+      </w:tr>
+      <w:tr>
+        <w:tc>
+          <w:tcPr>
+            <w:tcW w:type="dxa" w:w="700"/>
+            <w:vAlign w:val="center"/>
+            <w:tcMar>
+              <w:top w:w="80" w:type="dxa"/>
+              <w:left w:w="100" w:type="dxa"/>
+              <w:bottom w:w="80" w:type="dxa"/>
+              <w:right w:w="100" w:type="dxa"/>
+            </w:tcMar>
+          </w:tcPr>
+          <w:p>
+            <w:pPr>
+              <w:spacing w:before="0" w:after="0"/>
+              <w:jc w:val="left"/>
+            </w:pPr>
+            <w:r>
+              <w:rPr>
+                <w:rFonts w:ascii="Times New Roman" w:hAnsi="Times New Roman" w:eastAsia="Times New Roman" w:cs="Times New Roman"/>
+                <w:b w:val="0"/>
+                <w:sz w:val="24"/>
+                <w:szCs w:val="24"/>
+              </w:rPr>
+              <w:t>{{ loop.index }}</w:t>
+            </w:r>
+          </w:p>
+        </w:tc>
+        <w:tc>
+          <w:tcPr>
+            <w:tcW w:type="dxa" w:w="3300"/>
+            <w:vAlign w:val="center"/>
+            <w:tcMar>
+              <w:top w:w="80" w:type="dxa"/>
+              <w:left w:w="100" w:type="dxa"/>
+              <w:bottom w:w="80" w:type="dxa"/>
+              <w:right w:w="100" w:type="dxa"/>
+            </w:tcMar>
+          </w:tcPr>
+          <w:p>
+            <w:pPr>
+              <w:spacing w:before="0" w:after="0"/>
+              <w:jc w:val="left"/>
+            </w:pPr>
+            <w:r>
+              <w:rPr>
+                <w:rFonts w:ascii="Times New Roman" w:hAnsi="Times New Roman" w:eastAsia="Times New Roman" w:cs="Times New Roman"/>
+                <w:b w:val="0"/>
+                <w:sz w:val="24"/>
+                <w:szCs w:val="24"/>
+              </w:rPr>
+              <w:t>{{ student.nama }}</w:t>
+            </w:r>
+          </w:p>
+        </w:tc>
+        <w:tc>
+          <w:tcPr>
+            <w:tcW w:type="dxa" w:w="3100"/>
+            <w:vAlign w:val="center"/>
+            <w:tcMar>
+              <w:top w:w="80" w:type="dxa"/>
+              <w:left w:w="100" w:type="dxa"/>
+              <w:bottom w:w="80" w:type="dxa"/>
+              <w:right w:w="100" w:type="dxa"/>
+            </w:tcMar>
+          </w:tcPr>
+          <w:p>
+            <w:pPr>
+              <w:spacing w:before="0" w:after="0"/>
+              <w:jc w:val="left"/>
+            </w:pPr>
+            <w:r>
+              <w:rPr>
+                <w:rFonts w:ascii="Times New Roman" w:hAnsi="Times New Roman" w:eastAsia="Times New Roman" w:cs="Times New Roman"/>
+                <w:b w:val="0"/>
+                <w:sz w:val="24"/>
+                <w:szCs w:val="24"/>
+              </w:rPr>
+              <w:t>{{ student.nis }} / {{ student.nisn }}</w:t>
+            </w:r>
+          </w:p>
+        </w:tc>
+        <w:tc>
+          <w:tcPr>
+            <w:tcW w:type="dxa" w:w="1271"/>
+            <w:vAlign w:val="center"/>
+            <w:tcMar>
+              <w:top w:w="80" w:type="dxa"/>
+              <w:left w:w="100" w:type="dxa"/>
+              <w:bottom w:w="80" w:type="dxa"/>
+              <w:right w:w="100" w:type="dxa"/>
+            </w:tcMar>
+          </w:tcPr>
+          <w:p>
+            <w:pPr>
+              <w:spacing w:before="0" w:after="0"/>
+              <w:jc w:val="left"/>
+            </w:pPr>
+            <w:r>
+              <w:rPr>
+                <w:rFonts w:ascii="Times New Roman" w:hAnsi="Times New Roman" w:eastAsia="Times New Roman" w:cs="Times New Roman"/>
+                <w:b w:val="0"/>
+                <w:sz w:val="24"/>
+                <w:szCs w:val="24"/>
+              </w:rPr>
+              <w:t>{{ student.kelas }}</w:t>
+            </w:r>
+          </w:p>
+        </w:tc>
+      </w:tr>
+      <w:tr>
+        <w:tc>
+          <w:tcPr>
+            <w:tcW w:type="dxa" w:w="700"/>
+            <w:vAlign w:val="center"/>
+            <w:tcMar>
+              <w:top w:w="80" w:type="dxa"/>
+              <w:left w:w="100" w:type="dxa"/>
+              <w:bottom w:w="80" w:type="dxa"/>
+              <w:right w:w="100" w:type="dxa"/>
+            </w:tcMar>
+          </w:tcPr>
+          <w:p>
+            <w:pPr>
+              <w:spacing w:before="0" w:after="0"/>
+              <w:jc w:val="center"/>
+            </w:pPr>
+            <w:r>
+              <w:rPr>
+                <w:rFonts w:ascii="Times New Roman" w:hAnsi="Times New Roman" w:eastAsia="Times New Roman" w:cs="Times New Roman"/>
+                <w:b w:val="0"/>
+                <w:sz w:val="24"/>
+                <w:szCs w:val="24"/>
+              </w:rPr>
+              <w:t>{%tr endfor %}</w:t>
+            </w:r>
+          </w:p>
+        </w:tc>
+        <w:tc>
+          <w:tcPr>
+            <w:tcW w:type="dxa" w:w="3300"/>
+            <w:vAlign w:val="center"/>
+            <w:tcMar>
+              <w:top w:w="80" w:type="dxa"/>
+              <w:left w:w="100" w:type="dxa"/>
+              <w:bottom w:w="80" w:type="dxa"/>
+              <w:right w:w="100" w:type="dxa"/>
+            </w:tcMar>
+          </w:tcPr>
+          <w:p>
+            <w:pPr>
+              <w:spacing w:before="0" w:after="0"/>
+              <w:jc w:val="center"/>
+            </w:pPr>
+            <w:r>
+              <w:rPr>
+                <w:rFonts w:ascii="Times New Roman" w:hAnsi="Times New Roman" w:eastAsia="Times New Roman" w:cs="Times New Roman"/>
+                <w:b w:val="0"/>
+                <w:sz w:val="24"/>
+                <w:szCs w:val="24"/>
+              </w:rPr>
+            </w:r>
+          </w:p>
+        </w:tc>
+        <w:tc>
+          <w:tcPr>
+            <w:tcW w:type="dxa" w:w="3100"/>
+            <w:vAlign w:val="center"/>
+            <w:tcMar>
+              <w:top w:w="80" w:type="dxa"/>
+              <w:left w:w="100" w:type="dxa"/>
+              <w:bottom w:w="80" w:type="dxa"/>
+              <w:right w:w="100" w:type="dxa"/>
+            </w:tcMar>
+          </w:tcPr>
+          <w:p>
+            <w:pPr>
+              <w:spacing w:before="0" w:after="0"/>
+              <w:jc w:val="center"/>
+            </w:pPr>
+            <w:r>
+              <w:rPr>
+                <w:rFonts w:ascii="Times New Roman" w:hAnsi="Times New Roman" w:eastAsia="Times New Roman" w:cs="Times New Roman"/>
+                <w:b w:val="0"/>
+                <w:sz w:val="24"/>
+                <w:szCs w:val="24"/>
+              </w:rPr>
+            </w:r>
+          </w:p>
+        </w:tc>
+        <w:tc>
+          <w:tcPr>
+            <w:tcW w:type="dxa" w:w="1271"/>
+            <w:vAlign w:val="center"/>
+            <w:tcMar>
+              <w:top w:w="80" w:type="dxa"/>
+              <w:left w:w="100" w:type="dxa"/>
+              <w:bottom w:w="80" w:type="dxa"/>
+              <w:right w:w="100" w:type="dxa"/>
+            </w:tcMar>
+          </w:tcPr>
+          <w:p>
+            <w:pPr>
+              <w:spacing w:before="0" w:after="0"/>
+              <w:jc w:val="center"/>
+            </w:pPr>
+            <w:r>
+              <w:rPr>
+                <w:rFonts w:ascii="Times New Roman" w:hAnsi="Times New Roman" w:eastAsia="Times New Roman" w:cs="Times New Roman"/>
+                <w:b w:val="0"/>
+                <w:sz w:val="24"/>
+                <w:szCs w:val="24"/>
+              </w:rPr>
+            </w:r>
+          </w:p>
+        </w:tc>
+      </w:tr>
+    </w:tbl>
+    <w:p>
+      <w:pPr>
+        <w:keepNext/>
+        <w:spacing w:before="120" w:after="0" w:line="276" w:lineRule="auto"/>
+        <w:jc w:val="left"/>
+      </w:pPr>
+      <w:r>
+        <w:rPr>
+          <w:rFonts w:ascii="Times New Roman" w:hAnsi="Times New Roman" w:eastAsia="Times New Roman" w:cs="Times New Roman"/>
+          <w:b w:val="0"/>
+          <w:sz w:val="24"/>
+          <w:u w:val="none"/>
+          <w:szCs w:val="24"/>
+        </w:rPr>
+        <w:t>Rincian kegiatan:</w:t>
+      </w:r>
+    </w:p>
+    <w:tbl>
+      <w:tblPr>
         <w:tblW w:type="dxa" w:w="9071"/>
         <w:jc w:val="left"/>
         <w:tblLayout w:type="fixed"/>
@@ -167,327 +641,6 @@
         <w:gridCol w:w="227"/>
         <w:gridCol w:w="5896"/>
       </w:tblGrid>
-      <w:tr>
-        <w:tc>
-          <w:tcPr>
-            <w:tcW w:type="dxa" w:w="2948"/>
-            <w:vAlign w:val="center"/>
-            <w:tcMar>
-              <w:top w:w="80" w:type="dxa"/>
-              <w:left w:w="100" w:type="dxa"/>
-              <w:bottom w:w="80" w:type="dxa"/>
-              <w:right w:w="100" w:type="dxa"/>
-            </w:tcMar>
-            <w:tcBorders>
-              <w:top w:val="nil"/>
-              <w:left w:val="nil"/>
-              <w:bottom w:val="nil"/>
-              <w:right w:val="nil"/>
-              <w:insideH w:val="nil"/>
-              <w:insideV w:val="nil"/>
-            </w:tcBorders>
-          </w:tcPr>
-          <w:p>
-            <w:pPr>
-              <w:spacing w:before="0" w:after="0" w:line="276" w:lineRule="auto"/>
-              <w:jc w:val="left"/>
-            </w:pPr>
-            <w:r>
-              <w:rPr>
-                <w:rFonts w:ascii="Times New Roman" w:hAnsi="Times New Roman" w:eastAsia="Times New Roman" w:cs="Times New Roman"/>
-                <w:b w:val="0"/>
-                <w:sz w:val="24"/>
-                <w:szCs w:val="24"/>
-              </w:rPr>
-              <w:t>Nama Siswa</w:t>
-            </w:r>
-          </w:p>
-        </w:tc>
-        <w:tc>
-          <w:tcPr>
-            <w:tcW w:type="dxa" w:w="227"/>
-            <w:vAlign w:val="center"/>
-            <w:tcMar>
-              <w:top w:w="80" w:type="dxa"/>
-              <w:left w:w="100" w:type="dxa"/>
-              <w:bottom w:w="80" w:type="dxa"/>
-              <w:right w:w="100" w:type="dxa"/>
-            </w:tcMar>
-            <w:tcBorders>
-              <w:top w:val="nil"/>
-              <w:left w:val="nil"/>
-              <w:bottom w:val="nil"/>
-              <w:right w:val="nil"/>
-              <w:insideH w:val="nil"/>
-              <w:insideV w:val="nil"/>
-            </w:tcBorders>
-          </w:tcPr>
-          <w:p>
-            <w:pPr>
-              <w:spacing w:before="0" w:after="0" w:line="276" w:lineRule="auto"/>
-              <w:jc w:val="center"/>
-            </w:pPr>
-            <w:r>
-              <w:rPr>
-                <w:rFonts w:ascii="Times New Roman" w:hAnsi="Times New Roman" w:eastAsia="Times New Roman" w:cs="Times New Roman"/>
-                <w:b w:val="0"/>
-                <w:sz w:val="24"/>
-                <w:szCs w:val="24"/>
-              </w:rPr>
-              <w:t>:</w:t>
-            </w:r>
-          </w:p>
-        </w:tc>
-        <w:tc>
-          <w:tcPr>
-            <w:tcW w:type="dxa" w:w="5896"/>
-            <w:vAlign w:val="center"/>
-            <w:tcMar>
-              <w:top w:w="80" w:type="dxa"/>
-              <w:left w:w="100" w:type="dxa"/>
-              <w:bottom w:w="80" w:type="dxa"/>
-              <w:right w:w="100" w:type="dxa"/>
-            </w:tcMar>
-            <w:tcBorders>
-              <w:top w:val="nil"/>
-              <w:left w:val="nil"/>
-              <w:bottom w:val="nil"/>
-              <w:right w:val="nil"/>
-              <w:insideH w:val="nil"/>
-              <w:insideV w:val="nil"/>
-            </w:tcBorders>
-          </w:tcPr>
-          <w:p>
-            <w:pPr>
-              <w:spacing w:before="0" w:after="0" w:line="276" w:lineRule="auto"/>
-              <w:jc w:val="left"/>
-            </w:pPr>
-            <w:r>
-              <w:rPr>
-                <w:rFonts w:ascii="Times New Roman" w:hAnsi="Times New Roman" w:eastAsia="Times New Roman" w:cs="Times New Roman"/>
-                <w:b/>
-                <w:sz w:val="24"/>
-                <w:szCs w:val="24"/>
-              </w:rPr>
-              <w:t>{{ nama }}</w:t>
-            </w:r>
-          </w:p>
-        </w:tc>
-      </w:tr>
-      <w:tr>
-        <w:tc>
-          <w:tcPr>
-            <w:tcW w:type="dxa" w:w="2948"/>
-            <w:vAlign w:val="center"/>
-            <w:tcMar>
-              <w:top w:w="80" w:type="dxa"/>
-              <w:left w:w="100" w:type="dxa"/>
-              <w:bottom w:w="80" w:type="dxa"/>
-              <w:right w:w="100" w:type="dxa"/>
-            </w:tcMar>
-            <w:tcBorders>
-              <w:top w:val="nil"/>
-              <w:left w:val="nil"/>
-              <w:bottom w:val="nil"/>
-              <w:right w:val="nil"/>
-              <w:insideH w:val="nil"/>
-              <w:insideV w:val="nil"/>
-            </w:tcBorders>
-          </w:tcPr>
-          <w:p>
-            <w:pPr>
-              <w:spacing w:before="0" w:after="0" w:line="276" w:lineRule="auto"/>
-              <w:jc w:val="left"/>
-            </w:pPr>
-            <w:r>
-              <w:rPr>
-                <w:rFonts w:ascii="Times New Roman" w:hAnsi="Times New Roman" w:eastAsia="Times New Roman" w:cs="Times New Roman"/>
-                <w:b w:val="0"/>
-                <w:sz w:val="24"/>
-                <w:szCs w:val="24"/>
-              </w:rPr>
-              <w:t>NIS / NISN</w:t>
-            </w:r>
-          </w:p>
-        </w:tc>
-        <w:tc>
-          <w:tcPr>
-            <w:tcW w:type="dxa" w:w="227"/>
-            <w:vAlign w:val="center"/>
-            <w:tcMar>
-              <w:top w:w="80" w:type="dxa"/>
-              <w:left w:w="100" w:type="dxa"/>
-              <w:bottom w:w="80" w:type="dxa"/>
-              <w:right w:w="100" w:type="dxa"/>
-            </w:tcMar>
-            <w:tcBorders>
-              <w:top w:val="nil"/>
-              <w:left w:val="nil"/>
-              <w:bottom w:val="nil"/>
-              <w:right w:val="nil"/>
-              <w:insideH w:val="nil"/>
-              <w:insideV w:val="nil"/>
-            </w:tcBorders>
-          </w:tcPr>
-          <w:p>
-            <w:pPr>
-              <w:spacing w:before="0" w:after="0" w:line="276" w:lineRule="auto"/>
-              <w:jc w:val="center"/>
-            </w:pPr>
-            <w:r>
-              <w:rPr>
-                <w:rFonts w:ascii="Times New Roman" w:hAnsi="Times New Roman" w:eastAsia="Times New Roman" w:cs="Times New Roman"/>
-                <w:b w:val="0"/>
-                <w:sz w:val="24"/>
-                <w:szCs w:val="24"/>
-              </w:rPr>
-              <w:t>:</w:t>
-            </w:r>
-          </w:p>
-        </w:tc>
-        <w:tc>
-          <w:tcPr>
-            <w:tcW w:type="dxa" w:w="5896"/>
-            <w:vAlign w:val="center"/>
-            <w:tcMar>
-              <w:top w:w="80" w:type="dxa"/>
-              <w:left w:w="100" w:type="dxa"/>
-              <w:bottom w:w="80" w:type="dxa"/>
-              <w:right w:w="100" w:type="dxa"/>
-            </w:tcMar>
-            <w:tcBorders>
-              <w:top w:val="nil"/>
-              <w:left w:val="nil"/>
-              <w:bottom w:val="nil"/>
-              <w:right w:val="nil"/>
-              <w:insideH w:val="nil"/>
-              <w:insideV w:val="nil"/>
-            </w:tcBorders>
-          </w:tcPr>
-          <w:p>
-            <w:pPr>
-              <w:spacing w:before="0" w:after="0" w:line="276" w:lineRule="auto"/>
-              <w:jc w:val="left"/>
-            </w:pPr>
-            <w:r>
-              <w:rPr>
-                <w:rFonts w:ascii="Times New Roman" w:hAnsi="Times New Roman" w:eastAsia="Times New Roman" w:cs="Times New Roman"/>
-                <w:b/>
-                <w:sz w:val="24"/>
-                <w:szCs w:val="24"/>
-              </w:rPr>
-              <w:t>{{ nis }} / {{ nisn }}</w:t>
-            </w:r>
-          </w:p>
-        </w:tc>
-      </w:tr>
-      <w:tr>
-        <w:tc>
-          <w:tcPr>
-            <w:tcW w:type="dxa" w:w="2948"/>
-            <w:vAlign w:val="center"/>
-            <w:tcMar>
-              <w:top w:w="80" w:type="dxa"/>
-              <w:left w:w="100" w:type="dxa"/>
-              <w:bottom w:w="80" w:type="dxa"/>
-              <w:right w:w="100" w:type="dxa"/>
-            </w:tcMar>
-            <w:tcBorders>
-              <w:top w:val="nil"/>
-              <w:left w:val="nil"/>
-              <w:bottom w:val="nil"/>
-              <w:right w:val="nil"/>
-              <w:insideH w:val="nil"/>
-              <w:insideV w:val="nil"/>
-            </w:tcBorders>
-          </w:tcPr>
-          <w:p>
-            <w:pPr>
-              <w:spacing w:before="0" w:after="0" w:line="276" w:lineRule="auto"/>
-              <w:jc w:val="left"/>
-            </w:pPr>
-            <w:r>
-              <w:rPr>
-                <w:rFonts w:ascii="Times New Roman" w:hAnsi="Times New Roman" w:eastAsia="Times New Roman" w:cs="Times New Roman"/>
-                <w:b w:val="0"/>
-                <w:sz w:val="24"/>
-                <w:szCs w:val="24"/>
-              </w:rPr>
-              <w:t>Kelas</w:t>
-            </w:r>
-          </w:p>
-        </w:tc>
-        <w:tc>
-          <w:tcPr>
-            <w:tcW w:type="dxa" w:w="227"/>
-            <w:vAlign w:val="center"/>
-            <w:tcMar>
-              <w:top w:w="80" w:type="dxa"/>
-              <w:left w:w="100" w:type="dxa"/>
-              <w:bottom w:w="80" w:type="dxa"/>
-              <w:right w:w="100" w:type="dxa"/>
-            </w:tcMar>
-            <w:tcBorders>
-              <w:top w:val="nil"/>
-              <w:left w:val="nil"/>
-              <w:bottom w:val="nil"/>
-              <w:right w:val="nil"/>
-              <w:insideH w:val="nil"/>
-              <w:insideV w:val="nil"/>
-            </w:tcBorders>
-          </w:tcPr>
-          <w:p>
-            <w:pPr>
-              <w:spacing w:before="0" w:after="0" w:line="276" w:lineRule="auto"/>
-              <w:jc w:val="center"/>
-            </w:pPr>
-            <w:r>
-              <w:rPr>
-                <w:rFonts w:ascii="Times New Roman" w:hAnsi="Times New Roman" w:eastAsia="Times New Roman" w:cs="Times New Roman"/>
-                <w:b w:val="0"/>
-                <w:sz w:val="24"/>
-                <w:szCs w:val="24"/>
-              </w:rPr>
-              <w:t>:</w:t>
-            </w:r>
-          </w:p>
-        </w:tc>
-        <w:tc>
-          <w:tcPr>
-            <w:tcW w:type="dxa" w:w="5896"/>
-            <w:vAlign w:val="center"/>
-            <w:tcMar>
-              <w:top w:w="80" w:type="dxa"/>
-              <w:left w:w="100" w:type="dxa"/>
-              <w:bottom w:w="80" w:type="dxa"/>
-              <w:right w:w="100" w:type="dxa"/>
-            </w:tcMar>
-            <w:tcBorders>
-              <w:top w:val="nil"/>
-              <w:left w:val="nil"/>
-              <w:bottom w:val="nil"/>
-              <w:right w:val="nil"/>
-              <w:insideH w:val="nil"/>
-              <w:insideV w:val="nil"/>
-            </w:tcBorders>
-          </w:tcPr>
-          <w:p>
-            <w:pPr>
-              <w:spacing w:before="0" w:after="0" w:line="276" w:lineRule="auto"/>
-              <w:jc w:val="left"/>
-            </w:pPr>
-            <w:r>
-              <w:rPr>
-                <w:rFonts w:ascii="Times New Roman" w:hAnsi="Times New Roman" w:eastAsia="Times New Roman" w:cs="Times New Roman"/>
-                <w:b w:val="0"/>
-                <w:sz w:val="24"/>
-                <w:szCs w:val="24"/>
-              </w:rPr>
-              <w:t>Kelas {{ kelas }}</w:t>
-            </w:r>
-          </w:p>
-        </w:tc>
-      </w:tr>
       <w:tr>
         <w:tc>
           <w:tcPr>

</xml_diff>